<commit_message>
Aplciar a correlçao da pasta output
</commit_message>
<xml_diff>
--- a/doc/Roteiro_Webaula07_Oficina_Airflow-alunos.docx
+++ b/doc/Roteiro_Webaula07_Oficina_Airflow-alunos.docx
@@ -227,7 +227,7 @@
         <w:pStyle w:val="ListParagraph"/>
         <w:numPr>
           <w:ilvl w:val="0"/>
-          <w:numId w:val="3"/>
+          <w:numId w:val="4"/>
         </w:numPr>
         <w:spacing w:before="0" w:after="80"/>
         <w:rPr/>
@@ -246,7 +246,7 @@
         <w:pStyle w:val="ListParagraph"/>
         <w:numPr>
           <w:ilvl w:val="0"/>
-          <w:numId w:val="1"/>
+          <w:numId w:val="2"/>
         </w:numPr>
         <w:spacing w:before="0" w:after="80"/>
         <w:rPr/>
@@ -265,7 +265,7 @@
         <w:pStyle w:val="ListParagraph"/>
         <w:numPr>
           <w:ilvl w:val="0"/>
-          <w:numId w:val="1"/>
+          <w:numId w:val="2"/>
         </w:numPr>
         <w:spacing w:before="0" w:after="80"/>
         <w:rPr/>
@@ -284,7 +284,7 @@
         <w:pStyle w:val="ListParagraph"/>
         <w:numPr>
           <w:ilvl w:val="0"/>
-          <w:numId w:val="1"/>
+          <w:numId w:val="2"/>
         </w:numPr>
         <w:spacing w:before="0" w:after="80"/>
         <w:rPr/>
@@ -303,7 +303,7 @@
         <w:pStyle w:val="ListParagraph"/>
         <w:numPr>
           <w:ilvl w:val="0"/>
-          <w:numId w:val="1"/>
+          <w:numId w:val="2"/>
         </w:numPr>
         <w:spacing w:before="0" w:after="80"/>
         <w:rPr/>
@@ -438,19 +438,39 @@
       <w:pPr>
         <w:pStyle w:val="Normal"/>
         <w:spacing w:before="0" w:after="120"/>
-        <w:rPr/>
-      </w:pPr>
-      <w:r>
-        <w:rPr>
-          <w:rFonts w:eastAsia="Calibri" w:cs="Calibri" w:ascii="Calibri" w:hAnsi="Calibri"/>
-          <w:b w:val="false"/>
-          <w:bCs w:val="false"/>
-          <w:i w:val="false"/>
-          <w:iCs w:val="false"/>
-          <w:sz w:val="22"/>
-          <w:szCs w:val="22"/>
-        </w:rPr>
-        <w:t>2. Confirme que as ferramentas estão prontas:</w:t>
+        <w:rPr>
+          <w:rFonts w:ascii="Calibri" w:hAnsi="Calibri" w:eastAsia="Calibri" w:cs="Calibri"/>
+          <w:b w:val="false"/>
+          <w:bCs w:val="false"/>
+          <w:i w:val="false"/>
+          <w:iCs w:val="false"/>
+          <w:sz w:val="22"/>
+          <w:szCs w:val="22"/>
+        </w:rPr>
+      </w:pPr>
+      <w:r>
+        <w:rPr>
+          <w:rFonts w:eastAsia="Calibri" w:cs="Calibri" w:ascii="Calibri" w:hAnsi="Calibri"/>
+          <w:b w:val="false"/>
+          <w:bCs w:val="false"/>
+          <w:i w:val="false"/>
+          <w:iCs w:val="false"/>
+          <w:sz w:val="22"/>
+          <w:szCs w:val="22"/>
+        </w:rPr>
+        <w:t xml:space="preserve">2. </w:t>
+      </w:r>
+      <w:r>
+        <w:rPr>
+          <w:rFonts w:eastAsia="Calibri" w:cs="Calibri" w:ascii="Calibri" w:hAnsi="Calibri"/>
+          <w:b w:val="false"/>
+          <w:bCs w:val="false"/>
+          <w:i w:val="false"/>
+          <w:iCs w:val="false"/>
+          <w:sz w:val="22"/>
+          <w:szCs w:val="22"/>
+        </w:rPr>
+        <w:t>Instale o Astronomer client</w:t>
       </w:r>
     </w:p>
     <w:p>
@@ -473,101 +493,34 @@
           <w:sz w:val="20"/>
           <w:szCs w:val="20"/>
         </w:rPr>
-        <w:t>astro version</w:t>
-        <w:br/>
-        <w:t>docker --version</w:t>
-      </w:r>
-    </w:p>
-    <w:p>
-      <w:pPr>
-        <w:pStyle w:val="Normal"/>
-        <w:spacing w:before="0" w:after="120"/>
-        <w:rPr/>
-      </w:pPr>
-      <w:r>
-        <w:rPr>
-          <w:rFonts w:eastAsia="Calibri" w:cs="Calibri" w:ascii="Calibri" w:hAnsi="Calibri"/>
-          <w:b w:val="false"/>
-          <w:bCs w:val="false"/>
-          <w:i w:val="false"/>
-          <w:iCs w:val="false"/>
-          <w:sz w:val="22"/>
-          <w:szCs w:val="22"/>
-        </w:rPr>
-        <w:t>O Astro CLI é a ferramenta de linha de comando da Astronomer que facilita subir um ambiente Airflow completo na sua máquina. Por trás dos panos, ele usa o Docker para criar containers isolados — pequenos ambientes independentes — para cada peça da arquitetura do Airflow que vimos na Webaula 01: o Webserver (interface visual), o Scheduler (o componente que lê as DAGs e decide quando cada tarefa deve rodar) e o banco de metadados, que guarda o histórico de execuções.</w:t>
-      </w:r>
-    </w:p>
-    <w:p>
-      <w:pPr>
-        <w:pStyle w:val="Normal"/>
-        <w:spacing w:before="40" w:after="160"/>
-        <w:ind w:start="144"/>
-        <w:rPr/>
-      </w:pPr>
-      <w:r>
-        <w:rPr>
-          <w:rFonts w:eastAsia="Calibri" w:cs="Calibri" w:ascii="Calibri" w:hAnsi="Calibri"/>
-          <w:b/>
-          <w:bCs/>
-          <w:i/>
-          <w:iCs/>
-          <w:color w:val="2E5395"/>
-          <w:sz w:val="21"/>
-          <w:szCs w:val="21"/>
-        </w:rPr>
-        <w:t xml:space="preserve">Conceito relacionado: </w:t>
-      </w:r>
-      <w:r>
-        <w:rPr>
-          <w:rFonts w:eastAsia="Calibri" w:cs="Calibri" w:ascii="Calibri" w:hAnsi="Calibri"/>
-          <w:i/>
-          <w:iCs/>
-          <w:color w:val="2E5395"/>
-          <w:sz w:val="21"/>
-          <w:szCs w:val="21"/>
-        </w:rPr>
-        <w:t>arquitetura do Airflow (Webaula 01) — Webserver, Scheduler e banco de metadados, agora rodando de verdade dentro de containers Docker.</w:t>
-      </w:r>
-    </w:p>
-    <w:p>
-      <w:pPr>
-        <w:pStyle w:val="Heading2"/>
-        <w:spacing w:before="320" w:after="120"/>
-        <w:rPr/>
-      </w:pPr>
-      <w:r>
-        <w:rPr>
-          <w:b/>
-          <w:bCs/>
-        </w:rPr>
-        <w:t xml:space="preserve">Etapa 2 — Subindo o ambiente Airflow </w:t>
-      </w:r>
-      <w:r>
-        <w:rPr>
-          <w:i/>
-          <w:iCs/>
-          <w:color w:val="666666"/>
-        </w:rPr>
-        <w:t>(10 min)</w:t>
-      </w:r>
-    </w:p>
-    <w:p>
-      <w:pPr>
-        <w:pStyle w:val="Normal"/>
-        <w:spacing w:before="0" w:after="120"/>
-        <w:rPr/>
-      </w:pPr>
-      <w:r>
-        <w:rPr>
-          <w:rFonts w:eastAsia="Calibri" w:cs="Calibri" w:ascii="Calibri" w:hAnsi="Calibri"/>
-          <w:b w:val="false"/>
-          <w:bCs w:val="false"/>
-          <w:i w:val="false"/>
-          <w:iCs w:val="false"/>
-          <w:sz w:val="22"/>
-          <w:szCs w:val="22"/>
-        </w:rPr>
-        <w:t>3. Suba o ambiente:</w:t>
+        <w:t xml:space="preserve">winget install -e --id Astronomer.Astro </w:t>
+      </w:r>
+    </w:p>
+    <w:p>
+      <w:pPr>
+        <w:pStyle w:val="Normal"/>
+        <w:spacing w:before="0" w:after="120"/>
+        <w:rPr>
+          <w:rFonts w:ascii="Calibri" w:hAnsi="Calibri" w:eastAsia="Calibri" w:cs="Calibri"/>
+          <w:b w:val="false"/>
+          <w:bCs w:val="false"/>
+          <w:i w:val="false"/>
+          <w:iCs w:val="false"/>
+          <w:sz w:val="22"/>
+          <w:szCs w:val="22"/>
+        </w:rPr>
+      </w:pPr>
+      <w:r>
+        <w:rPr>
+          <w:rFonts w:eastAsia="Calibri" w:cs="Calibri" w:ascii="Calibri" w:hAnsi="Calibri"/>
+          <w:b w:val="false"/>
+          <w:bCs w:val="false"/>
+          <w:i w:val="false"/>
+          <w:iCs w:val="false"/>
+          <w:sz w:val="22"/>
+          <w:szCs w:val="22"/>
+        </w:rPr>
+        <w:t>Confirme que as ferramentas estão prontas:</w:t>
       </w:r>
     </w:p>
     <w:p>
@@ -582,11 +535,7 @@
         <w:shd w:val="clear" w:fill="F2F2F2"/>
         <w:spacing w:before="100" w:after="200"/>
         <w:ind w:start="215" w:end="215"/>
-        <w:rPr>
-          <w:rFonts w:ascii="Consolas" w:hAnsi="Consolas" w:eastAsia="Consolas" w:cs="Consolas"/>
-          <w:sz w:val="20"/>
-          <w:szCs w:val="20"/>
-        </w:rPr>
+        <w:rPr/>
       </w:pPr>
       <w:r>
         <w:rPr>
@@ -594,7 +543,101 @@
           <w:sz w:val="20"/>
           <w:szCs w:val="20"/>
         </w:rPr>
-        <w:t>astro dev init</w:t>
+        <w:t>astro version</w:t>
+        <w:br/>
+        <w:t>docker --version</w:t>
+      </w:r>
+    </w:p>
+    <w:p>
+      <w:pPr>
+        <w:pStyle w:val="Normal"/>
+        <w:spacing w:before="0" w:after="120"/>
+        <w:rPr/>
+      </w:pPr>
+      <w:r>
+        <w:rPr>
+          <w:rFonts w:eastAsia="Calibri" w:cs="Calibri" w:ascii="Calibri" w:hAnsi="Calibri"/>
+          <w:b w:val="false"/>
+          <w:bCs w:val="false"/>
+          <w:i w:val="false"/>
+          <w:iCs w:val="false"/>
+          <w:sz w:val="22"/>
+          <w:szCs w:val="22"/>
+        </w:rPr>
+        <w:t>O Astro CLI é a ferramenta de linha de comando da Astronomer que facilita subir um ambiente Airflow completo na sua máquina. Por trás dos panos, ele usa o Docker para criar containers isolados — pequenos ambientes independentes — para cada peça da arquitetura do Airflow que vimos na Webaula 01: o Webserver (interface visual), o Scheduler (o componente que lê as DAGs e decide quando cada tarefa deve rodar) e o banco de metadados, que guarda o histórico de execuções.</w:t>
+      </w:r>
+    </w:p>
+    <w:p>
+      <w:pPr>
+        <w:pStyle w:val="Normal"/>
+        <w:spacing w:before="40" w:after="160"/>
+        <w:ind w:start="144"/>
+        <w:rPr/>
+      </w:pPr>
+      <w:r>
+        <w:rPr>
+          <w:rFonts w:eastAsia="Calibri" w:cs="Calibri" w:ascii="Calibri" w:hAnsi="Calibri"/>
+          <w:b/>
+          <w:bCs/>
+          <w:i/>
+          <w:iCs/>
+          <w:color w:val="2E5395"/>
+          <w:sz w:val="21"/>
+          <w:szCs w:val="21"/>
+        </w:rPr>
+        <w:t xml:space="preserve">Conceito relacionado: </w:t>
+      </w:r>
+      <w:r>
+        <w:rPr>
+          <w:rFonts w:eastAsia="Calibri" w:cs="Calibri" w:ascii="Calibri" w:hAnsi="Calibri"/>
+          <w:i/>
+          <w:iCs/>
+          <w:color w:val="2E5395"/>
+          <w:sz w:val="21"/>
+          <w:szCs w:val="21"/>
+        </w:rPr>
+        <w:t>arquitetura do Airflow (Webaula 01) — Webserver, Scheduler e banco de metadados, agora rodando de verdade dentro de containers Docker.</w:t>
+      </w:r>
+    </w:p>
+    <w:p>
+      <w:pPr>
+        <w:pStyle w:val="Heading2"/>
+        <w:spacing w:before="320" w:after="120"/>
+        <w:rPr/>
+      </w:pPr>
+      <w:r>
+        <w:rPr>
+          <w:b/>
+          <w:bCs/>
+        </w:rPr>
+        <w:t xml:space="preserve">Etapa 2 — Subindo o ambiente Airflow </w:t>
+      </w:r>
+      <w:r>
+        <w:rPr>
+          <w:i/>
+          <w:iCs/>
+          <w:color w:val="666666"/>
+        </w:rPr>
+        <w:t>(10 min)</w:t>
+      </w:r>
+    </w:p>
+    <w:p>
+      <w:pPr>
+        <w:pStyle w:val="Normal"/>
+        <w:spacing w:before="0" w:after="120"/>
+        <w:rPr/>
+      </w:pPr>
+      <w:r>
+        <w:rPr>
+          <w:rFonts w:eastAsia="Calibri" w:cs="Calibri" w:ascii="Calibri" w:hAnsi="Calibri"/>
+          <w:b w:val="false"/>
+          <w:bCs w:val="false"/>
+          <w:i w:val="false"/>
+          <w:iCs w:val="false"/>
+          <w:sz w:val="22"/>
+          <w:szCs w:val="22"/>
+        </w:rPr>
+        <w:t>3. Suba o ambiente:</w:t>
       </w:r>
     </w:p>
     <w:p>
@@ -621,45 +664,7 @@
           <w:sz w:val="20"/>
           <w:szCs w:val="20"/>
         </w:rPr>
-        <w:t>astro dev start</w:t>
-      </w:r>
-    </w:p>
-    <w:p>
-      <w:pPr>
-        <w:pStyle w:val="Normal"/>
-        <w:spacing w:before="0" w:after="120"/>
-        <w:rPr/>
-      </w:pPr>
-      <w:r>
-        <w:rPr>
-          <w:rFonts w:eastAsia="Calibri" w:cs="Calibri" w:ascii="Calibri" w:hAnsi="Calibri"/>
-          <w:b w:val="false"/>
-          <w:bCs w:val="false"/>
-          <w:i w:val="false"/>
-          <w:iCs w:val="false"/>
-          <w:sz w:val="22"/>
-          <w:szCs w:val="22"/>
-        </w:rPr>
-        <w:t>Esse comando cria e inicia os containers Docker com todos os componentes do Airflow. Pode levar alguns minutos na primeira vez, porque o Docker precisa baixar as imagens necessárias. Enquanto isso acontece, pense no que está sendo montado: um Scheduler que vai monitorar continuamente a pasta dags/ em busca de arquivos Python com pipelines definidos, e um Webserver que vai expor uma interface para você acompanhar tudo visualmente.</w:t>
-      </w:r>
-    </w:p>
-    <w:p>
-      <w:pPr>
-        <w:pStyle w:val="Normal"/>
-        <w:spacing w:before="0" w:after="120"/>
-        <w:rPr/>
-      </w:pPr>
-      <w:r>
-        <w:rPr>
-          <w:rFonts w:eastAsia="Calibri" w:cs="Calibri" w:ascii="Calibri" w:hAnsi="Calibri"/>
-          <w:b w:val="false"/>
-          <w:bCs w:val="false"/>
-          <w:i w:val="false"/>
-          <w:iCs w:val="false"/>
-          <w:sz w:val="22"/>
-          <w:szCs w:val="22"/>
-        </w:rPr>
-        <w:t>4. Assim que o comando terminar, acesse a interface do Airflow no navegador:</w:t>
+        <w:t>astro dev init</w:t>
       </w:r>
     </w:p>
     <w:p>
@@ -674,6 +679,71 @@
         <w:shd w:val="clear" w:fill="F2F2F2"/>
         <w:spacing w:before="100" w:after="200"/>
         <w:ind w:start="215" w:end="215"/>
+        <w:rPr>
+          <w:rFonts w:ascii="Consolas" w:hAnsi="Consolas" w:eastAsia="Consolas" w:cs="Consolas"/>
+          <w:sz w:val="20"/>
+          <w:szCs w:val="20"/>
+        </w:rPr>
+      </w:pPr>
+      <w:r>
+        <w:rPr>
+          <w:rFonts w:eastAsia="Consolas" w:cs="Consolas" w:ascii="Consolas" w:hAnsi="Consolas"/>
+          <w:sz w:val="20"/>
+          <w:szCs w:val="20"/>
+        </w:rPr>
+        <w:t>astro dev start</w:t>
+      </w:r>
+    </w:p>
+    <w:p>
+      <w:pPr>
+        <w:pStyle w:val="Normal"/>
+        <w:spacing w:before="0" w:after="120"/>
+        <w:rPr/>
+      </w:pPr>
+      <w:r>
+        <w:rPr>
+          <w:rFonts w:eastAsia="Calibri" w:cs="Calibri" w:ascii="Calibri" w:hAnsi="Calibri"/>
+          <w:b w:val="false"/>
+          <w:bCs w:val="false"/>
+          <w:i w:val="false"/>
+          <w:iCs w:val="false"/>
+          <w:sz w:val="22"/>
+          <w:szCs w:val="22"/>
+        </w:rPr>
+        <w:t>Esse comando cria e inicia os containers Docker com todos os componentes do Airflow. Pode levar alguns minutos na primeira vez, porque o Docker precisa baixar as imagens necessárias. Enquanto isso acontece, pense no que está sendo montado: um Scheduler que vai monitorar continuamente a pasta dags/ em busca de arquivos Python com pipelines definidos, e um Webserver que vai expor uma interface para você acompanhar tudo visualmente.</w:t>
+      </w:r>
+    </w:p>
+    <w:p>
+      <w:pPr>
+        <w:pStyle w:val="Normal"/>
+        <w:spacing w:before="0" w:after="120"/>
+        <w:rPr/>
+      </w:pPr>
+      <w:r>
+        <w:rPr>
+          <w:rFonts w:eastAsia="Calibri" w:cs="Calibri" w:ascii="Calibri" w:hAnsi="Calibri"/>
+          <w:b w:val="false"/>
+          <w:bCs w:val="false"/>
+          <w:i w:val="false"/>
+          <w:iCs w:val="false"/>
+          <w:sz w:val="22"/>
+          <w:szCs w:val="22"/>
+        </w:rPr>
+        <w:t>4. Assim que o comando terminar, acesse a interface do Airflow no navegador:</w:t>
+      </w:r>
+    </w:p>
+    <w:p>
+      <w:pPr>
+        <w:pStyle w:val="Normal"/>
+        <w:pBdr>
+          <w:top w:val="single" w:sz="4" w:space="0" w:color="CCCCCC"/>
+          <w:left w:val="single" w:sz="4" w:space="0" w:color="CCCCCC"/>
+          <w:bottom w:val="single" w:sz="4" w:space="0" w:color="CCCCCC"/>
+          <w:right w:val="single" w:sz="4" w:space="0" w:color="CCCCCC"/>
+        </w:pBdr>
+        <w:shd w:val="clear" w:fill="F2F2F2"/>
+        <w:spacing w:before="100" w:after="200"/>
+        <w:ind w:start="215" w:end="215"/>
         <w:rPr/>
       </w:pPr>
       <w:r>
@@ -754,7 +824,7 @@
         <w:pStyle w:val="ListParagraph"/>
         <w:numPr>
           <w:ilvl w:val="0"/>
-          <w:numId w:val="1"/>
+          <w:numId w:val="2"/>
         </w:numPr>
         <w:spacing w:before="0" w:after="80"/>
         <w:rPr/>
@@ -773,7 +843,7 @@
         <w:pStyle w:val="ListParagraph"/>
         <w:numPr>
           <w:ilvl w:val="0"/>
-          <w:numId w:val="1"/>
+          <w:numId w:val="2"/>
         </w:numPr>
         <w:spacing w:before="0" w:after="80"/>
         <w:rPr/>
@@ -792,7 +862,7 @@
         <w:pStyle w:val="ListParagraph"/>
         <w:numPr>
           <w:ilvl w:val="0"/>
-          <w:numId w:val="1"/>
+          <w:numId w:val="2"/>
         </w:numPr>
         <w:spacing w:before="0" w:after="80"/>
         <w:rPr/>
@@ -811,7 +881,7 @@
         <w:pStyle w:val="ListParagraph"/>
         <w:numPr>
           <w:ilvl w:val="0"/>
-          <w:numId w:val="1"/>
+          <w:numId w:val="2"/>
         </w:numPr>
         <w:spacing w:before="0" w:after="80"/>
         <w:rPr/>
@@ -830,7 +900,7 @@
         <w:pStyle w:val="ListParagraph"/>
         <w:numPr>
           <w:ilvl w:val="0"/>
-          <w:numId w:val="1"/>
+          <w:numId w:val="2"/>
         </w:numPr>
         <w:spacing w:before="0" w:after="80"/>
         <w:rPr/>
@@ -909,7 +979,7 @@
         <w:pStyle w:val="ListParagraph"/>
         <w:numPr>
           <w:ilvl w:val="0"/>
-          <w:numId w:val="1"/>
+          <w:numId w:val="2"/>
         </w:numPr>
         <w:spacing w:before="0" w:after="80"/>
         <w:rPr/>
@@ -928,7 +998,7 @@
         <w:pStyle w:val="ListParagraph"/>
         <w:numPr>
           <w:ilvl w:val="0"/>
-          <w:numId w:val="1"/>
+          <w:numId w:val="2"/>
         </w:numPr>
         <w:spacing w:before="0" w:after="80"/>
         <w:rPr/>
@@ -947,7 +1017,7 @@
         <w:pStyle w:val="ListParagraph"/>
         <w:numPr>
           <w:ilvl w:val="0"/>
-          <w:numId w:val="1"/>
+          <w:numId w:val="2"/>
         </w:numPr>
         <w:spacing w:before="0" w:after="80"/>
         <w:rPr/>
@@ -1534,6 +1604,7 @@
         </w:tabs>
         <w:ind w:start="1080" w:hanging="360"/>
       </w:pPr>
+      <w:rPr/>
     </w:lvl>
     <w:lvl w:ilvl="2">
       <w:start w:val="1"/>
@@ -1546,6 +1617,7 @@
         </w:tabs>
         <w:ind w:start="1440" w:hanging="360"/>
       </w:pPr>
+      <w:rPr/>
     </w:lvl>
     <w:lvl w:ilvl="3">
       <w:start w:val="1"/>
@@ -1558,6 +1630,7 @@
         </w:tabs>
         <w:ind w:start="1800" w:hanging="360"/>
       </w:pPr>
+      <w:rPr/>
     </w:lvl>
     <w:lvl w:ilvl="4">
       <w:start w:val="1"/>
@@ -1570,6 +1643,7 @@
         </w:tabs>
         <w:ind w:start="2160" w:hanging="360"/>
       </w:pPr>
+      <w:rPr/>
     </w:lvl>
     <w:lvl w:ilvl="5">
       <w:start w:val="1"/>
@@ -1582,6 +1656,7 @@
         </w:tabs>
         <w:ind w:start="2520" w:hanging="360"/>
       </w:pPr>
+      <w:rPr/>
     </w:lvl>
     <w:lvl w:ilvl="6">
       <w:start w:val="1"/>
@@ -1594,6 +1669,7 @@
         </w:tabs>
         <w:ind w:start="2880" w:hanging="360"/>
       </w:pPr>
+      <w:rPr/>
     </w:lvl>
     <w:lvl w:ilvl="7">
       <w:start w:val="1"/>
@@ -1606,6 +1682,7 @@
         </w:tabs>
         <w:ind w:start="3240" w:hanging="360"/>
       </w:pPr>
+      <w:rPr/>
     </w:lvl>
     <w:lvl w:ilvl="8">
       <w:start w:val="1"/>
@@ -1618,9 +1695,131 @@
         </w:tabs>
         <w:ind w:start="3600" w:hanging="360"/>
       </w:pPr>
+      <w:rPr/>
     </w:lvl>
   </w:abstractNum>
   <w:abstractNum w:abstractNumId="2">
+    <w:lvl w:ilvl="0">
+      <w:start w:val="1"/>
+      <w:numFmt w:val="bullet"/>
+      <w:lvlText w:val=""/>
+      <w:lvlJc w:val="start"/>
+      <w:pPr>
+        <w:tabs>
+          <w:tab w:val="num" w:pos="0"/>
+        </w:tabs>
+        <w:ind w:start="460" w:hanging="260"/>
+      </w:pPr>
+      <w:rPr>
+        <w:rFonts w:ascii="Symbol" w:hAnsi="Symbol" w:cs="Symbol" w:hint="default"/>
+      </w:rPr>
+    </w:lvl>
+    <w:lvl w:ilvl="1">
+      <w:start w:val="1"/>
+      <w:numFmt w:val="decimal"/>
+      <w:lvlText w:val="%2."/>
+      <w:lvlJc w:val="start"/>
+      <w:pPr>
+        <w:tabs>
+          <w:tab w:val="num" w:pos="1080"/>
+        </w:tabs>
+        <w:ind w:start="1080" w:hanging="360"/>
+      </w:pPr>
+      <w:rPr/>
+    </w:lvl>
+    <w:lvl w:ilvl="2">
+      <w:start w:val="1"/>
+      <w:numFmt w:val="decimal"/>
+      <w:lvlText w:val="%3."/>
+      <w:lvlJc w:val="start"/>
+      <w:pPr>
+        <w:tabs>
+          <w:tab w:val="num" w:pos="1440"/>
+        </w:tabs>
+        <w:ind w:start="1440" w:hanging="360"/>
+      </w:pPr>
+      <w:rPr/>
+    </w:lvl>
+    <w:lvl w:ilvl="3">
+      <w:start w:val="1"/>
+      <w:numFmt w:val="decimal"/>
+      <w:lvlText w:val="%4."/>
+      <w:lvlJc w:val="start"/>
+      <w:pPr>
+        <w:tabs>
+          <w:tab w:val="num" w:pos="1800"/>
+        </w:tabs>
+        <w:ind w:start="1800" w:hanging="360"/>
+      </w:pPr>
+      <w:rPr/>
+    </w:lvl>
+    <w:lvl w:ilvl="4">
+      <w:start w:val="1"/>
+      <w:numFmt w:val="decimal"/>
+      <w:lvlText w:val="%5."/>
+      <w:lvlJc w:val="start"/>
+      <w:pPr>
+        <w:tabs>
+          <w:tab w:val="num" w:pos="2160"/>
+        </w:tabs>
+        <w:ind w:start="2160" w:hanging="360"/>
+      </w:pPr>
+      <w:rPr/>
+    </w:lvl>
+    <w:lvl w:ilvl="5">
+      <w:start w:val="1"/>
+      <w:numFmt w:val="decimal"/>
+      <w:lvlText w:val="%6."/>
+      <w:lvlJc w:val="start"/>
+      <w:pPr>
+        <w:tabs>
+          <w:tab w:val="num" w:pos="2520"/>
+        </w:tabs>
+        <w:ind w:start="2520" w:hanging="360"/>
+      </w:pPr>
+      <w:rPr/>
+    </w:lvl>
+    <w:lvl w:ilvl="6">
+      <w:start w:val="1"/>
+      <w:numFmt w:val="decimal"/>
+      <w:lvlText w:val="%7."/>
+      <w:lvlJc w:val="start"/>
+      <w:pPr>
+        <w:tabs>
+          <w:tab w:val="num" w:pos="2880"/>
+        </w:tabs>
+        <w:ind w:start="2880" w:hanging="360"/>
+      </w:pPr>
+      <w:rPr/>
+    </w:lvl>
+    <w:lvl w:ilvl="7">
+      <w:start w:val="1"/>
+      <w:numFmt w:val="decimal"/>
+      <w:lvlText w:val="%8."/>
+      <w:lvlJc w:val="start"/>
+      <w:pPr>
+        <w:tabs>
+          <w:tab w:val="num" w:pos="3240"/>
+        </w:tabs>
+        <w:ind w:start="3240" w:hanging="360"/>
+      </w:pPr>
+      <w:rPr/>
+    </w:lvl>
+    <w:lvl w:ilvl="8">
+      <w:start w:val="1"/>
+      <w:numFmt w:val="decimal"/>
+      <w:lvlText w:val="%9."/>
+      <w:lvlJc w:val="start"/>
+      <w:pPr>
+        <w:tabs>
+          <w:tab w:val="num" w:pos="3600"/>
+        </w:tabs>
+        <w:ind w:start="3600" w:hanging="360"/>
+      </w:pPr>
+      <w:rPr/>
+    </w:lvl>
+  </w:abstractNum>
+  <w:abstractNum w:abstractNumId="3">
     <w:lvl w:ilvl="0">
       <w:start w:val="1"/>
       <w:numFmt w:val="none"/>
@@ -1746,7 +1945,10 @@
     <w:abstractNumId w:val="2"/>
   </w:num>
   <w:num w:numId="3">
-    <w:abstractNumId w:val="1"/>
+    <w:abstractNumId w:val="3"/>
+  </w:num>
+  <w:num w:numId="4">
+    <w:abstractNumId w:val="2"/>
     <w:lvlOverride w:ilvl="0">
       <w:startOverride w:val="1"/>
     </w:lvlOverride>
@@ -1774,6 +1976,7 @@
     <w:qFormat/>
     <w:pPr>
       <w:widowControl/>
+      <w:suppressAutoHyphens w:val="true"/>
       <w:bidi w:val="0"/>
       <w:spacing w:before="0" w:after="0"/>
       <w:jc w:val="start"/>
@@ -1789,7 +1992,7 @@
   </w:style>
   <w:style w:type="paragraph" w:styleId="Heading1">
     <w:name w:val="heading 1"/>
-    <w:basedOn w:val="Ttulo"/>
+    <w:basedOn w:val="Ttulouser"/>
     <w:qFormat/>
     <w:pPr/>
     <w:rPr>
@@ -1800,7 +2003,7 @@
   </w:style>
   <w:style w:type="paragraph" w:styleId="Heading2">
     <w:name w:val="heading 2"/>
-    <w:basedOn w:val="Ttulo"/>
+    <w:basedOn w:val="Ttulouser"/>
     <w:qFormat/>
     <w:pPr/>
     <w:rPr>
@@ -1811,7 +2014,7 @@
   </w:style>
   <w:style w:type="paragraph" w:styleId="Heading3">
     <w:name w:val="heading 3"/>
-    <w:basedOn w:val="Ttulo"/>
+    <w:basedOn w:val="Ttulouser"/>
     <w:qFormat/>
     <w:pPr/>
     <w:rPr>
@@ -1822,7 +2025,7 @@
   </w:style>
   <w:style w:type="paragraph" w:styleId="Heading4">
     <w:name w:val="heading 4"/>
-    <w:basedOn w:val="Ttulo"/>
+    <w:basedOn w:val="Ttulouser"/>
     <w:qFormat/>
     <w:pPr/>
     <w:rPr>
@@ -1833,7 +2036,7 @@
   </w:style>
   <w:style w:type="paragraph" w:styleId="Heading5">
     <w:name w:val="heading 5"/>
-    <w:basedOn w:val="Ttulo"/>
+    <w:basedOn w:val="Ttulouser"/>
     <w:qFormat/>
     <w:pPr/>
     <w:rPr>
@@ -1842,7 +2045,7 @@
   </w:style>
   <w:style w:type="paragraph" w:styleId="Heading6">
     <w:name w:val="heading 6"/>
-    <w:basedOn w:val="Ttulo"/>
+    <w:basedOn w:val="Ttulouser"/>
     <w:qFormat/>
     <w:pPr/>
     <w:rPr>
@@ -1858,11 +2061,18 @@
       <w:u w:val="single"/>
     </w:rPr>
   </w:style>
-  <w:style w:type="character" w:styleId="Caracteresdenotaderodap">
-    <w:name w:val="Caracteres de nota de rodapé"/>
+  <w:style w:type="character" w:styleId="Caracteresdenotaderodapuser">
+    <w:name w:val="Caracteres de nota de rodapé (user)"/>
     <w:uiPriority w:val="99"/>
     <w:semiHidden/>
     <w:unhideWhenUsed/>
+    <w:qFormat/>
+    <w:rPr>
+      <w:vertAlign w:val="superscript"/>
+    </w:rPr>
+  </w:style>
+  <w:style w:type="character" w:styleId="Caracteresdenotaderodap">
+    <w:name w:val="Caracteres de nota de rodapé"/>
     <w:qFormat/>
     <w:rPr>
       <w:vertAlign w:val="superscript"/>
@@ -1885,11 +2095,18 @@
       <w:szCs w:val="20"/>
     </w:rPr>
   </w:style>
-  <w:style w:type="character" w:styleId="Caracteresdenotadefim">
-    <w:name w:val="Caracteres de nota de fim"/>
+  <w:style w:type="character" w:styleId="Caracteresdenotadefimuser">
+    <w:name w:val="Caracteres de nota de fim (user)"/>
     <w:uiPriority w:val="99"/>
     <w:semiHidden/>
     <w:unhideWhenUsed/>
+    <w:qFormat/>
+    <w:rPr>
+      <w:vertAlign w:val="superscript"/>
+    </w:rPr>
+  </w:style>
+  <w:style w:type="character" w:styleId="Caracteresdenotadefim">
+    <w:name w:val="Caracteres de nota de fim"/>
     <w:qFormat/>
     <w:rPr>
       <w:vertAlign w:val="superscript"/>
@@ -1970,9 +2187,35 @@
       <w:rFonts w:cs="Lucida Sans"/>
     </w:rPr>
   </w:style>
+  <w:style w:type="paragraph" w:styleId="Ttulouser">
+    <w:name w:val="Título (user)"/>
+    <w:basedOn w:val="Normal"/>
+    <w:next w:val="BodyText"/>
+    <w:qFormat/>
+    <w:pPr>
+      <w:keepNext w:val="true"/>
+      <w:spacing w:before="240" w:after="120"/>
+    </w:pPr>
+    <w:rPr>
+      <w:rFonts w:ascii="Liberation Sans" w:hAnsi="Liberation Sans" w:eastAsia="Microsoft YaHei" w:cs="Lucida Sans"/>
+      <w:sz w:val="28"/>
+      <w:szCs w:val="28"/>
+    </w:rPr>
+  </w:style>
+  <w:style w:type="paragraph" w:styleId="ndiceuser">
+    <w:name w:val="Índice (user)"/>
+    <w:basedOn w:val="Normal"/>
+    <w:qFormat/>
+    <w:pPr>
+      <w:suppressLineNumbers/>
+    </w:pPr>
+    <w:rPr>
+      <w:rFonts w:cs="Lucida Sans"/>
+    </w:rPr>
+  </w:style>
   <w:style w:type="paragraph" w:styleId="Title">
     <w:name w:val="Title"/>
-    <w:basedOn w:val="Ttulo"/>
+    <w:basedOn w:val="Ttulouser"/>
     <w:qFormat/>
     <w:pPr/>
     <w:rPr>
@@ -1985,6 +2228,7 @@
     <w:qFormat/>
     <w:pPr>
       <w:widowControl/>
+      <w:suppressAutoHyphens w:val="true"/>
       <w:bidi w:val="0"/>
       <w:spacing w:before="0" w:after="0"/>
       <w:jc w:val="start"/>
@@ -2005,6 +2249,7 @@
     <w:qFormat/>
     <w:pPr>
       <w:widowControl/>
+      <w:suppressAutoHyphens w:val="true"/>
       <w:bidi w:val="0"/>
       <w:spacing w:before="0" w:after="0"/>
       <w:jc w:val="start"/>

</xml_diff>